<commit_message>
Se realiza finalizacion de codigo, de modo que el servicio entrega words con los oficios generados
</commit_message>
<xml_diff>
--- a/plantillas/Formato Citación CPACA2011 (Automatizado).docx
+++ b/plantillas/Formato Citación CPACA2011 (Automatizado).docx
@@ -71,7 +71,7 @@
           <w:sz w:val="24"/>
           <w:szCs w:val="24"/>
         </w:rPr>
-        <w:t>281564</w:t>
+        <w:t>«Numero_Documento»</w:t>
       </w:r>
       <w:r>
         <w:rPr>
@@ -123,6 +123,21 @@
           <w:sz w:val="24"/>
           <w:szCs w:val="24"/>
         </w:rPr>
+        <w:fldChar w:fldCharType="separate"/>
+      </w:r>
+      <w:r>
+        <w:rPr>
+          <w:noProof/>
+          <w:sz w:val="24"/>
+          <w:szCs w:val="24"/>
+        </w:rPr>
+        <w:t>«Correo_Electronico»</w:t>
+      </w:r>
+      <w:r>
+        <w:rPr>
+          <w:sz w:val="24"/>
+          <w:szCs w:val="24"/>
+        </w:rPr>
         <w:fldChar w:fldCharType="end"/>
       </w:r>
     </w:p>
@@ -176,7 +191,7 @@
           <w:sz w:val="24"/>
           <w:szCs w:val="24"/>
         </w:rPr>
-        <w:t>CR 17 51 83 SUR Bogotá</w:t>
+        <w:t>«No_DireccionEfectiva»</w:t>
       </w:r>
       <w:r>
         <w:rPr>
@@ -236,7 +251,7 @@
           <w:sz w:val="24"/>
           <w:szCs w:val="24"/>
         </w:rPr>
-        <w:t>Bogota la Calera</w:t>
+        <w:t>«Regional»</w:t>
       </w:r>
       <w:r>
         <w:rPr>
@@ -279,7 +294,7 @@
           <w:sz w:val="24"/>
           <w:szCs w:val="24"/>
         </w:rPr>
-        <w:t>DRBC</w:t>
+        <w:t>«INDICADOR»</w:t>
       </w:r>
       <w:r>
         <w:rPr>
@@ -339,7 +354,7 @@
           <w:sz w:val="24"/>
           <w:szCs w:val="24"/>
         </w:rPr>
-        <w:t>YUBER YESID CARDENAS PULIDO</w:t>
+        <w:t>«DIRECTOR_REGIONAL»</w:t>
       </w:r>
       <w:r>
         <w:rPr>
@@ -408,7 +423,7 @@
           <w:sz w:val="24"/>
           <w:szCs w:val="24"/>
         </w:rPr>
-        <w:t>40388</w:t>
+        <w:t>«numero_expediente»</w:t>
       </w:r>
       <w:r>
         <w:rPr>
@@ -422,14 +437,7 @@
           <w:sz w:val="24"/>
           <w:szCs w:val="24"/>
         </w:rPr>
-        <w:t xml:space="preserve"> </w:t>
-      </w:r>
-      <w:r>
-        <w:rPr>
-          <w:sz w:val="24"/>
-          <w:szCs w:val="24"/>
-        </w:rPr>
-        <w:t xml:space="preserve">Citación notificación personal </w:t>
+        <w:t xml:space="preserve"> Citación notificación personal </w:t>
       </w:r>
       <w:r>
         <w:rPr>
@@ -458,7 +466,7 @@
           <w:sz w:val="24"/>
           <w:szCs w:val="24"/>
         </w:rPr>
-        <w:t>Diana Carolina Morera Acuña</w:t>
+        <w:t>«NotificadorRevisor»</w:t>
       </w:r>
       <w:r>
         <w:rPr>
@@ -472,14 +480,7 @@
           <w:sz w:val="24"/>
           <w:szCs w:val="24"/>
         </w:rPr>
-        <w:t xml:space="preserve"> </w:t>
-      </w:r>
-      <w:r>
-        <w:rPr>
-          <w:sz w:val="24"/>
-          <w:szCs w:val="24"/>
-        </w:rPr>
-        <w:t xml:space="preserve"> </w:t>
+        <w:t xml:space="preserve">  </w:t>
       </w:r>
       <w:r>
         <w:rPr>
@@ -508,7 +509,7 @@
           <w:sz w:val="24"/>
           <w:szCs w:val="24"/>
         </w:rPr>
-        <w:t>Resolución DRBC No.  01237000081  de  31 marzo 2023</w:t>
+        <w:t>«Acto_Administrativo_No_y_fecha»</w:t>
       </w:r>
       <w:r>
         <w:rPr>
@@ -606,7 +607,7 @@
           <w:sz w:val="24"/>
           <w:szCs w:val="24"/>
         </w:rPr>
-        <w:t>de la</w:t>
+        <w:t>«articulo_preposicion»</w:t>
       </w:r>
       <w:r>
         <w:rPr>
@@ -649,7 +650,7 @@
           <w:sz w:val="24"/>
           <w:szCs w:val="24"/>
         </w:rPr>
-        <w:t>Resolución DRBC No.  01237000081  de  31 marzo 2023</w:t>
+        <w:t>«Acto_Administrativo_No_y_fecha»</w:t>
       </w:r>
       <w:r>
         <w:rPr>
@@ -698,7 +699,7 @@
         </w:rPr>
         <w:t xml:space="preserve"> siguiendo la ruta: Servicio al Ciudadano &gt; Crear una Petición, Queja, Reclamo o Solicitud, o en el link </w:t>
       </w:r>
-      <w:hyperlink r:id="rId6">
+      <w:hyperlink r:id="rId4">
         <w:r>
           <w:rPr>
             <w:color w:val="0000FF"/>
@@ -771,7 +772,7 @@
           <w:szCs w:val="24"/>
           <w:shd w:val="clear" w:color="auto" w:fill="FF9900"/>
         </w:rPr>
-        <w:t>Bogota la Calera</w:t>
+        <w:t>«Regional»</w:t>
       </w:r>
       <w:r>
         <w:rPr>
@@ -820,14 +821,24 @@
           <w:szCs w:val="24"/>
           <w:shd w:val="clear" w:color="auto" w:fill="FF9900"/>
         </w:rPr>
-        <w:t>Carrera 10 N° 16-82 piso 4</w:t>
-      </w:r>
-      <w:r>
-        <w:rPr>
+        <w:t>«</w:t>
+      </w:r>
+      <w:proofErr w:type="spellStart"/>
+      <w:r>
+        <w:rPr>
+          <w:noProof/>
           <w:sz w:val="24"/>
           <w:szCs w:val="24"/>
           <w:shd w:val="clear" w:color="auto" w:fill="FF9900"/>
         </w:rPr>
+        <w:t>DIRECCION_REGIONAL»</w:t>
+      </w:r>
+      <w:r>
+        <w:rPr>
+          <w:sz w:val="24"/>
+          <w:szCs w:val="24"/>
+          <w:shd w:val="clear" w:color="auto" w:fill="FF9900"/>
+        </w:rPr>
         <w:fldChar w:fldCharType="end"/>
       </w:r>
       <w:r>
@@ -836,23 +847,16 @@
           <w:szCs w:val="24"/>
           <w:highlight w:val="white"/>
         </w:rPr>
-        <w:t>d</w:t>
-      </w:r>
-      <w:r>
-        <w:rPr>
-          <w:sz w:val="24"/>
-          <w:szCs w:val="24"/>
-          <w:highlight w:val="white"/>
-        </w:rPr>
-        <w:t>el municipio de</w:t>
-      </w:r>
-      <w:r>
-        <w:rPr>
-          <w:sz w:val="24"/>
-          <w:szCs w:val="24"/>
-          <w:highlight w:val="white"/>
-        </w:rPr>
-        <w:t xml:space="preserve"> </w:t>
+        <w:t>del</w:t>
+      </w:r>
+      <w:proofErr w:type="spellEnd"/>
+      <w:r>
+        <w:rPr>
+          <w:sz w:val="24"/>
+          <w:szCs w:val="24"/>
+          <w:highlight w:val="white"/>
+        </w:rPr>
+        <w:t xml:space="preserve"> municipio de </w:t>
       </w:r>
       <w:r>
         <w:rPr>
@@ -885,7 +889,7 @@
           <w:szCs w:val="24"/>
           <w:highlight w:val="white"/>
         </w:rPr>
-        <w:t>Diana Carolina Morera Acuña</w:t>
+        <w:t>«NotificadorRevisor»</w:t>
       </w:r>
       <w:r>
         <w:rPr>
@@ -994,7 +998,16 @@
           <w:szCs w:val="24"/>
           <w:highlight w:val="white"/>
         </w:rPr>
-        <w:t xml:space="preserve">Con base a lo anterior y en aras de garantizar que la diligencia en mención se realice de forma efectiva, le informamos que al presentarse deberá exhibir la cédula de ciudadanía. En caso que no pueda presentarse a la diligencia citada, podrá autorizar a quien encuentre conveniente, para lo cual esta persona también deberá exhibir además de la cédula de ciudadanía, autorización expresa para notificarse suscrita por el titular del presente o poder debidamente otorgado y copia de </w:t>
+        <w:t xml:space="preserve">Con base a lo anterior y en aras de garantizar que la diligencia en mención se realice de forma efectiva, le informamos que al presentarse deberá exhibir la cédula de ciudadanía. En caso que no pueda presentarse a la diligencia citada, podrá autorizar a quien encuentre conveniente, para lo cual esta persona también deberá exhibir </w:t>
+      </w:r>
+      <w:r>
+        <w:rPr>
+          <w:sz w:val="24"/>
+          <w:szCs w:val="24"/>
+          <w:highlight w:val="white"/>
+        </w:rPr>
+        <w:lastRenderedPageBreak/>
+        <w:t xml:space="preserve">además de la cédula de ciudadanía, autorización expresa para notificarse suscrita por el titular del presente o poder debidamente otorgado y copia de </w:t>
       </w:r>
       <w:proofErr w:type="gramStart"/>
       <w:r>
@@ -1070,9 +1083,7 @@
     </w:p>
     <w:tbl>
       <w:tblPr>
-        <w:tblStyle w:val="a0"/>
         <w:tblW w:w="14139" w:type="dxa"/>
-        <w:tblInd w:w="0" w:type="dxa"/>
         <w:tblBorders>
           <w:top w:val="nil"/>
           <w:left w:val="nil"/>
@@ -1130,21 +1141,12 @@
         </w:tc>
       </w:tr>
     </w:tbl>
-    <w:p>
-      <w:pPr>
-        <w:shd w:val="clear" w:color="auto" w:fill="FFFFFF"/>
-        <w:rPr>
-          <w:sz w:val="24"/>
-          <w:szCs w:val="24"/>
-          <w:highlight w:val="white"/>
-        </w:rPr>
-      </w:pPr>
-    </w:p>
+    <w:p/>
     <w:sectPr>
-      <w:pgSz w:w="11909" w:h="16834"/>
-      <w:pgMar w:top="1440" w:right="1440" w:bottom="1440" w:left="1440" w:header="720" w:footer="720" w:gutter="0"/>
-      <w:pgNumType w:start="1"/>
-      <w:cols w:space="720"/>
+      <w:pgSz w:w="12240" w:h="15840"/>
+      <w:pgMar w:top="1417" w:right="1701" w:bottom="1417" w:left="1701" w:header="708" w:footer="708" w:gutter="0"/>
+      <w:cols w:space="708"/>
+      <w:docGrid w:linePitch="360"/>
     </w:sectPr>
   </w:body>
 </w:document>
@@ -1155,15 +1157,17 @@
   <w:docDefaults>
     <w:rPrDefault>
       <w:rPr>
-        <w:rFonts w:ascii="Arial" w:eastAsia="Arial" w:hAnsi="Arial" w:cs="Arial"/>
+        <w:rFonts w:asciiTheme="minorHAnsi" w:eastAsiaTheme="minorHAnsi" w:hAnsiTheme="minorHAnsi" w:cstheme="minorBidi"/>
+        <w:kern w:val="2"/>
         <w:sz w:val="22"/>
         <w:szCs w:val="22"/>
-        <w:lang w:val="es" w:eastAsia="es-CO" w:bidi="ar-SA"/>
+        <w:lang w:val="es-CO" w:eastAsia="en-US" w:bidi="ar-SA"/>
+        <w14:ligatures w14:val="standardContextual"/>
       </w:rPr>
     </w:rPrDefault>
     <w:pPrDefault>
       <w:pPr>
-        <w:spacing w:line="276" w:lineRule="auto"/>
+        <w:spacing w:after="160" w:line="259" w:lineRule="auto"/>
       </w:pPr>
     </w:pPrDefault>
   </w:docDefaults>
@@ -1547,140 +1551,15 @@
   </w:latentStyles>
   <w:style w:type="paragraph" w:default="1" w:styleId="Normal">
     <w:name w:val="Normal"/>
-  </w:style>
-  <w:style w:type="paragraph" w:styleId="Ttulo1">
-    <w:name w:val="heading 1"/>
-    <w:basedOn w:val="Normal"/>
-    <w:next w:val="Normal"/>
+    <w:rsid w:val="0019107B"/>
     <w:pPr>
-      <w:keepNext/>
-      <w:keepLines/>
-      <w:spacing w:before="400" w:after="120"/>
-      <w:outlineLvl w:val="0"/>
+      <w:spacing w:after="0" w:line="276" w:lineRule="auto"/>
     </w:pPr>
     <w:rPr>
-      <w:sz w:val="40"/>
-      <w:szCs w:val="40"/>
-    </w:rPr>
-  </w:style>
-  <w:style w:type="paragraph" w:styleId="Ttulo2">
-    <w:name w:val="heading 2"/>
-    <w:basedOn w:val="Normal"/>
-    <w:next w:val="Normal"/>
-    <w:pPr>
-      <w:keepNext/>
-      <w:keepLines/>
-      <w:spacing w:before="360" w:after="120"/>
-      <w:outlineLvl w:val="1"/>
-    </w:pPr>
-    <w:rPr>
-      <w:sz w:val="32"/>
-      <w:szCs w:val="32"/>
-    </w:rPr>
-  </w:style>
-  <w:style w:type="paragraph" w:styleId="Ttulo3">
-    <w:name w:val="heading 3"/>
-    <w:basedOn w:val="Normal"/>
-    <w:next w:val="Normal"/>
-    <w:pPr>
-      <w:keepNext/>
-      <w:keepLines/>
-      <w:spacing w:before="320" w:after="80"/>
-      <w:outlineLvl w:val="2"/>
-    </w:pPr>
-    <w:rPr>
-      <w:color w:val="434343"/>
-      <w:sz w:val="28"/>
-      <w:szCs w:val="28"/>
-    </w:rPr>
-  </w:style>
-  <w:style w:type="paragraph" w:styleId="Ttulo4">
-    <w:name w:val="heading 4"/>
-    <w:basedOn w:val="Normal"/>
-    <w:next w:val="Normal"/>
-    <w:pPr>
-      <w:keepNext/>
-      <w:keepLines/>
-      <w:spacing w:before="280" w:after="80"/>
-      <w:outlineLvl w:val="3"/>
-    </w:pPr>
-    <w:rPr>
-      <w:color w:val="666666"/>
-      <w:sz w:val="24"/>
-      <w:szCs w:val="24"/>
-    </w:rPr>
-  </w:style>
-  <w:style w:type="paragraph" w:styleId="Ttulo5">
-    <w:name w:val="heading 5"/>
-    <w:basedOn w:val="Normal"/>
-    <w:next w:val="Normal"/>
-    <w:pPr>
-      <w:keepNext/>
-      <w:keepLines/>
-      <w:spacing w:before="240" w:after="80"/>
-      <w:outlineLvl w:val="4"/>
-    </w:pPr>
-    <w:rPr>
-      <w:color w:val="666666"/>
-    </w:rPr>
-  </w:style>
-  <w:style w:type="paragraph" w:styleId="Ttulo6">
-    <w:name w:val="heading 6"/>
-    <w:basedOn w:val="Normal"/>
-    <w:next w:val="Normal"/>
-    <w:pPr>
-      <w:keepNext/>
-      <w:keepLines/>
-      <w:spacing w:before="240" w:after="80"/>
-      <w:outlineLvl w:val="5"/>
-    </w:pPr>
-    <w:rPr>
-      <w:i/>
-      <w:color w:val="666666"/>
-    </w:rPr>
-  </w:style>
-  <w:style w:type="paragraph" w:styleId="Ttulo7">
-    <w:name w:val="heading 7"/>
-    <w:basedOn w:val="Normal"/>
-    <w:next w:val="Normal"/>
-    <w:link w:val="Ttulo7Car"/>
-    <w:uiPriority w:val="9"/>
-    <w:unhideWhenUsed/>
-    <w:qFormat/>
-    <w:rsid w:val="00DD2A7F"/>
-    <w:pPr>
-      <w:keepNext/>
-      <w:keepLines/>
-      <w:spacing w:before="40"/>
-      <w:outlineLvl w:val="6"/>
-    </w:pPr>
-    <w:rPr>
-      <w:rFonts w:asciiTheme="majorHAnsi" w:eastAsiaTheme="majorEastAsia" w:hAnsiTheme="majorHAnsi" w:cstheme="majorBidi"/>
-      <w:i/>
-      <w:iCs/>
-      <w:color w:val="243F60" w:themeColor="accent1" w:themeShade="7F"/>
-    </w:rPr>
-  </w:style>
-  <w:style w:type="paragraph" w:styleId="Ttulo8">
-    <w:name w:val="heading 8"/>
-    <w:basedOn w:val="Normal"/>
-    <w:next w:val="Normal"/>
-    <w:link w:val="Ttulo8Car"/>
-    <w:uiPriority w:val="9"/>
-    <w:unhideWhenUsed/>
-    <w:qFormat/>
-    <w:rsid w:val="00DD2A7F"/>
-    <w:pPr>
-      <w:keepNext/>
-      <w:keepLines/>
-      <w:spacing w:before="40"/>
-      <w:outlineLvl w:val="7"/>
-    </w:pPr>
-    <w:rPr>
-      <w:rFonts w:asciiTheme="majorHAnsi" w:eastAsiaTheme="majorEastAsia" w:hAnsiTheme="majorHAnsi" w:cstheme="majorBidi"/>
-      <w:color w:val="272727" w:themeColor="text1" w:themeTint="D8"/>
-      <w:sz w:val="21"/>
-      <w:szCs w:val="21"/>
+      <w:rFonts w:ascii="Arial" w:eastAsia="Arial" w:hAnsi="Arial" w:cs="Arial"/>
+      <w:kern w:val="0"/>
+      <w:lang w:val="es" w:eastAsia="es-CO"/>
+      <w14:ligatures w14:val="none"/>
     </w:rPr>
   </w:style>
   <w:style w:type="character" w:default="1" w:styleId="Fuentedeprrafopredeter">
@@ -1710,123 +1589,26 @@
     <w:semiHidden/>
     <w:unhideWhenUsed/>
   </w:style>
-  <w:style w:type="table" w:customStyle="1" w:styleId="TableNormal">
-    <w:name w:val="Table Normal"/>
-    <w:tblPr>
-      <w:tblCellMar>
-        <w:top w:w="0" w:type="dxa"/>
-        <w:left w:w="0" w:type="dxa"/>
-        <w:bottom w:w="0" w:type="dxa"/>
-        <w:right w:w="0" w:type="dxa"/>
-      </w:tblCellMar>
-    </w:tblPr>
-  </w:style>
-  <w:style w:type="paragraph" w:styleId="Ttulo">
-    <w:name w:val="Title"/>
-    <w:basedOn w:val="Normal"/>
-    <w:next w:val="Normal"/>
-    <w:pPr>
-      <w:keepNext/>
-      <w:keepLines/>
-      <w:spacing w:after="60"/>
-    </w:pPr>
-    <w:rPr>
-      <w:sz w:val="52"/>
-      <w:szCs w:val="52"/>
-    </w:rPr>
-  </w:style>
-  <w:style w:type="table" w:customStyle="1" w:styleId="TableNormal0">
-    <w:name w:val="Table Normal"/>
-    <w:tblPr>
-      <w:tblCellMar>
-        <w:top w:w="0" w:type="dxa"/>
-        <w:left w:w="0" w:type="dxa"/>
-        <w:bottom w:w="0" w:type="dxa"/>
-        <w:right w:w="0" w:type="dxa"/>
-      </w:tblCellMar>
-    </w:tblPr>
-  </w:style>
-  <w:style w:type="paragraph" w:styleId="Subttulo">
-    <w:name w:val="Subtitle"/>
-    <w:basedOn w:val="Normal"/>
-    <w:next w:val="Normal"/>
-    <w:pPr>
-      <w:keepNext/>
-      <w:keepLines/>
-      <w:spacing w:after="320"/>
-    </w:pPr>
-    <w:rPr>
-      <w:color w:val="666666"/>
-      <w:sz w:val="30"/>
-      <w:szCs w:val="30"/>
-    </w:rPr>
-  </w:style>
-  <w:style w:type="table" w:customStyle="1" w:styleId="a">
-    <w:basedOn w:val="TableNormal0"/>
-    <w:tblPr>
-      <w:tblStyleRowBandSize w:val="1"/>
-      <w:tblStyleColBandSize w:val="1"/>
-      <w:tblCellMar>
-        <w:top w:w="100" w:type="dxa"/>
-        <w:left w:w="100" w:type="dxa"/>
-        <w:bottom w:w="100" w:type="dxa"/>
-        <w:right w:w="100" w:type="dxa"/>
-      </w:tblCellMar>
-    </w:tblPr>
-  </w:style>
-  <w:style w:type="table" w:customStyle="1" w:styleId="a0">
-    <w:basedOn w:val="TableNormal0"/>
-    <w:tblPr>
-      <w:tblStyleRowBandSize w:val="1"/>
-      <w:tblStyleColBandSize w:val="1"/>
-      <w:tblCellMar>
-        <w:top w:w="100" w:type="dxa"/>
-        <w:left w:w="100" w:type="dxa"/>
-        <w:bottom w:w="100" w:type="dxa"/>
-        <w:right w:w="100" w:type="dxa"/>
-      </w:tblCellMar>
-    </w:tblPr>
-  </w:style>
-  <w:style w:type="character" w:customStyle="1" w:styleId="Ttulo7Car">
-    <w:name w:val="Título 7 Car"/>
-    <w:basedOn w:val="Fuentedeprrafopredeter"/>
-    <w:link w:val="Ttulo7"/>
-    <w:uiPriority w:val="9"/>
-    <w:rsid w:val="00DD2A7F"/>
-    <w:rPr>
-      <w:rFonts w:asciiTheme="majorHAnsi" w:eastAsiaTheme="majorEastAsia" w:hAnsiTheme="majorHAnsi" w:cstheme="majorBidi"/>
-      <w:i/>
-      <w:iCs/>
-      <w:color w:val="243F60" w:themeColor="accent1" w:themeShade="7F"/>
-    </w:rPr>
-  </w:style>
   <w:style w:type="paragraph" w:styleId="Sinespaciado">
     <w:name w:val="No Spacing"/>
     <w:uiPriority w:val="1"/>
     <w:qFormat/>
-    <w:rsid w:val="00DD2A7F"/>
+    <w:rsid w:val="0019107B"/>
     <w:pPr>
-      <w:spacing w:line="240" w:lineRule="auto"/>
+      <w:spacing w:after="0" w:line="240" w:lineRule="auto"/>
     </w:pPr>
-  </w:style>
-  <w:style w:type="character" w:customStyle="1" w:styleId="Ttulo8Car">
-    <w:name w:val="Título 8 Car"/>
-    <w:basedOn w:val="Fuentedeprrafopredeter"/>
-    <w:link w:val="Ttulo8"/>
-    <w:uiPriority w:val="9"/>
-    <w:rsid w:val="00DD2A7F"/>
     <w:rPr>
-      <w:rFonts w:asciiTheme="majorHAnsi" w:eastAsiaTheme="majorEastAsia" w:hAnsiTheme="majorHAnsi" w:cstheme="majorBidi"/>
-      <w:color w:val="272727" w:themeColor="text1" w:themeTint="D8"/>
-      <w:sz w:val="21"/>
-      <w:szCs w:val="21"/>
+      <w:rFonts w:ascii="Arial" w:eastAsia="Arial" w:hAnsi="Arial" w:cs="Arial"/>
+      <w:kern w:val="0"/>
+      <w:lang w:val="es" w:eastAsia="es-CO"/>
+      <w14:ligatures w14:val="none"/>
     </w:rPr>
   </w:style>
 </w:styles>
 </file>
 
 <file path=word/theme/theme1.xml><?xml version="1.0" encoding="utf-8"?>
-<a:theme xmlns:a="http://schemas.openxmlformats.org/drawingml/2006/main" name="Office Theme">
+<a:theme xmlns:a="http://schemas.openxmlformats.org/drawingml/2006/main" name="Tema de Office">
   <a:themeElements>
     <a:clrScheme name="Office">
       <a:dk1>
@@ -1836,44 +1618,44 @@
         <a:sysClr val="window" lastClr="FFFFFF"/>
       </a:lt1>
       <a:dk2>
-        <a:srgbClr val="1F497D"/>
+        <a:srgbClr val="44546A"/>
       </a:dk2>
       <a:lt2>
-        <a:srgbClr val="EEECE1"/>
+        <a:srgbClr val="E7E6E6"/>
       </a:lt2>
       <a:accent1>
-        <a:srgbClr val="4F81BD"/>
+        <a:srgbClr val="4472C4"/>
       </a:accent1>
       <a:accent2>
-        <a:srgbClr val="C0504D"/>
+        <a:srgbClr val="ED7D31"/>
       </a:accent2>
       <a:accent3>
-        <a:srgbClr val="9BBB59"/>
+        <a:srgbClr val="A5A5A5"/>
       </a:accent3>
       <a:accent4>
-        <a:srgbClr val="8064A2"/>
+        <a:srgbClr val="FFC000"/>
       </a:accent4>
       <a:accent5>
-        <a:srgbClr val="4BACC6"/>
+        <a:srgbClr val="5B9BD5"/>
       </a:accent5>
       <a:accent6>
-        <a:srgbClr val="F79646"/>
+        <a:srgbClr val="70AD47"/>
       </a:accent6>
       <a:hlink>
-        <a:srgbClr val="0000FF"/>
+        <a:srgbClr val="0563C1"/>
       </a:hlink>
       <a:folHlink>
-        <a:srgbClr val="800080"/>
+        <a:srgbClr val="954F72"/>
       </a:folHlink>
     </a:clrScheme>
     <a:fontScheme name="Office">
       <a:majorFont>
-        <a:latin typeface="Calibri"/>
+        <a:latin typeface="Calibri Light" panose="020F0302020204030204"/>
         <a:ea typeface=""/>
         <a:cs typeface=""/>
-        <a:font script="Jpan" typeface="ＭＳ ゴシック"/>
+        <a:font script="Jpan" typeface="游ゴシック Light"/>
         <a:font script="Hang" typeface="맑은 고딕"/>
-        <a:font script="Hans" typeface="宋体"/>
+        <a:font script="Hans" typeface="等线 Light"/>
         <a:font script="Hant" typeface="新細明體"/>
         <a:font script="Arab" typeface="Times New Roman"/>
         <a:font script="Hebr" typeface="Times New Roman"/>
@@ -1901,14 +1683,31 @@
         <a:font script="Viet" typeface="Times New Roman"/>
         <a:font script="Uigh" typeface="Microsoft Uighur"/>
         <a:font script="Geor" typeface="Sylfaen"/>
+        <a:font script="Armn" typeface="Arial"/>
+        <a:font script="Bugi" typeface="Leelawadee UI"/>
+        <a:font script="Bopo" typeface="Microsoft JhengHei"/>
+        <a:font script="Java" typeface="Javanese Text"/>
+        <a:font script="Lisu" typeface="Segoe UI"/>
+        <a:font script="Mymr" typeface="Myanmar Text"/>
+        <a:font script="Nkoo" typeface="Ebrima"/>
+        <a:font script="Olck" typeface="Nirmala UI"/>
+        <a:font script="Osma" typeface="Ebrima"/>
+        <a:font script="Phag" typeface="Phagspa"/>
+        <a:font script="Syrn" typeface="Estrangelo Edessa"/>
+        <a:font script="Syrj" typeface="Estrangelo Edessa"/>
+        <a:font script="Syre" typeface="Estrangelo Edessa"/>
+        <a:font script="Sora" typeface="Nirmala UI"/>
+        <a:font script="Tale" typeface="Microsoft Tai Le"/>
+        <a:font script="Talu" typeface="Microsoft New Tai Lue"/>
+        <a:font script="Tfng" typeface="Ebrima"/>
       </a:majorFont>
       <a:minorFont>
-        <a:latin typeface="Cambria"/>
+        <a:latin typeface="Calibri" panose="020F0502020204030204"/>
         <a:ea typeface=""/>
         <a:cs typeface=""/>
-        <a:font script="Jpan" typeface="ＭＳ 明朝"/>
+        <a:font script="Jpan" typeface="游明朝"/>
         <a:font script="Hang" typeface="맑은 고딕"/>
-        <a:font script="Hans" typeface="宋体"/>
+        <a:font script="Hans" typeface="等线"/>
         <a:font script="Hant" typeface="新細明體"/>
         <a:font script="Arab" typeface="Arial"/>
         <a:font script="Hebr" typeface="Arial"/>
@@ -1936,6 +1735,23 @@
         <a:font script="Viet" typeface="Arial"/>
         <a:font script="Uigh" typeface="Microsoft Uighur"/>
         <a:font script="Geor" typeface="Sylfaen"/>
+        <a:font script="Armn" typeface="Arial"/>
+        <a:font script="Bugi" typeface="Leelawadee UI"/>
+        <a:font script="Bopo" typeface="Microsoft JhengHei"/>
+        <a:font script="Java" typeface="Javanese Text"/>
+        <a:font script="Lisu" typeface="Segoe UI"/>
+        <a:font script="Mymr" typeface="Myanmar Text"/>
+        <a:font script="Nkoo" typeface="Ebrima"/>
+        <a:font script="Olck" typeface="Nirmala UI"/>
+        <a:font script="Osma" typeface="Ebrima"/>
+        <a:font script="Phag" typeface="Phagspa"/>
+        <a:font script="Syrn" typeface="Estrangelo Edessa"/>
+        <a:font script="Syrj" typeface="Estrangelo Edessa"/>
+        <a:font script="Syre" typeface="Estrangelo Edessa"/>
+        <a:font script="Sora" typeface="Nirmala UI"/>
+        <a:font script="Tale" typeface="Microsoft Tai Le"/>
+        <a:font script="Talu" typeface="Microsoft New Tai Lue"/>
+        <a:font script="Tfng" typeface="Ebrima"/>
       </a:minorFont>
     </a:fontScheme>
     <a:fmtScheme name="Office">
@@ -1947,227 +1763,141 @@
           <a:gsLst>
             <a:gs pos="0">
               <a:schemeClr val="phClr">
-                <a:tint val="50000"/>
-                <a:satMod val="300000"/>
+                <a:lumMod val="110000"/>
+                <a:satMod val="105000"/>
+                <a:tint val="67000"/>
               </a:schemeClr>
             </a:gs>
-            <a:gs pos="35000">
+            <a:gs pos="50000">
               <a:schemeClr val="phClr">
-                <a:tint val="37000"/>
-                <a:satMod val="300000"/>
+                <a:lumMod val="105000"/>
+                <a:satMod val="103000"/>
+                <a:tint val="73000"/>
               </a:schemeClr>
             </a:gs>
             <a:gs pos="100000">
               <a:schemeClr val="phClr">
-                <a:tint val="15000"/>
-                <a:satMod val="350000"/>
+                <a:lumMod val="105000"/>
+                <a:satMod val="109000"/>
+                <a:tint val="81000"/>
               </a:schemeClr>
             </a:gs>
           </a:gsLst>
-          <a:lin ang="16200000" scaled="1"/>
+          <a:lin ang="5400000" scaled="0"/>
         </a:gradFill>
         <a:gradFill rotWithShape="1">
           <a:gsLst>
             <a:gs pos="0">
               <a:schemeClr val="phClr">
-                <a:tint val="100000"/>
+                <a:satMod val="103000"/>
+                <a:lumMod val="102000"/>
+                <a:tint val="94000"/>
+              </a:schemeClr>
+            </a:gs>
+            <a:gs pos="50000">
+              <a:schemeClr val="phClr">
+                <a:satMod val="110000"/>
+                <a:lumMod val="100000"/>
                 <a:shade val="100000"/>
-                <a:satMod val="130000"/>
               </a:schemeClr>
             </a:gs>
             <a:gs pos="100000">
               <a:schemeClr val="phClr">
-                <a:tint val="50000"/>
-                <a:shade val="100000"/>
-                <a:satMod val="350000"/>
+                <a:lumMod val="99000"/>
+                <a:satMod val="120000"/>
+                <a:shade val="78000"/>
               </a:schemeClr>
             </a:gs>
           </a:gsLst>
-          <a:lin ang="16200000" scaled="0"/>
+          <a:lin ang="5400000" scaled="0"/>
         </a:gradFill>
       </a:fillStyleLst>
       <a:lnStyleLst>
-        <a:ln w="9525" cap="flat" cmpd="sng" algn="ctr">
-          <a:solidFill>
-            <a:schemeClr val="phClr">
-              <a:shade val="95000"/>
-              <a:satMod val="105000"/>
-            </a:schemeClr>
-          </a:solidFill>
-          <a:prstDash val="solid"/>
-        </a:ln>
-        <a:ln w="25400" cap="flat" cmpd="sng" algn="ctr">
+        <a:ln w="6350" cap="flat" cmpd="sng" algn="ctr">
           <a:solidFill>
             <a:schemeClr val="phClr"/>
           </a:solidFill>
           <a:prstDash val="solid"/>
+          <a:miter lim="800000"/>
         </a:ln>
-        <a:ln w="38100" cap="flat" cmpd="sng" algn="ctr">
+        <a:ln w="12700" cap="flat" cmpd="sng" algn="ctr">
           <a:solidFill>
             <a:schemeClr val="phClr"/>
           </a:solidFill>
           <a:prstDash val="solid"/>
+          <a:miter lim="800000"/>
+        </a:ln>
+        <a:ln w="19050" cap="flat" cmpd="sng" algn="ctr">
+          <a:solidFill>
+            <a:schemeClr val="phClr"/>
+          </a:solidFill>
+          <a:prstDash val="solid"/>
+          <a:miter lim="800000"/>
         </a:ln>
       </a:lnStyleLst>
       <a:effectStyleLst>
         <a:effectStyle>
+          <a:effectLst/>
+        </a:effectStyle>
+        <a:effectStyle>
+          <a:effectLst/>
+        </a:effectStyle>
+        <a:effectStyle>
           <a:effectLst>
-            <a:outerShdw blurRad="40000" dist="20000" dir="5400000" rotWithShape="0">
+            <a:outerShdw blurRad="57150" dist="19050" dir="5400000" algn="ctr" rotWithShape="0">
               <a:srgbClr val="000000">
-                <a:alpha val="38000"/>
+                <a:alpha val="63000"/>
               </a:srgbClr>
             </a:outerShdw>
           </a:effectLst>
-        </a:effectStyle>
-        <a:effectStyle>
-          <a:effectLst>
-            <a:outerShdw blurRad="40000" dist="23000" dir="5400000" rotWithShape="0">
-              <a:srgbClr val="000000">
-                <a:alpha val="35000"/>
-              </a:srgbClr>
-            </a:outerShdw>
-          </a:effectLst>
-        </a:effectStyle>
-        <a:effectStyle>
-          <a:effectLst>
-            <a:outerShdw blurRad="40000" dist="23000" dir="5400000" rotWithShape="0">
-              <a:srgbClr val="000000">
-                <a:alpha val="35000"/>
-              </a:srgbClr>
-            </a:outerShdw>
-          </a:effectLst>
-          <a:scene3d>
-            <a:camera prst="orthographicFront">
-              <a:rot lat="0" lon="0" rev="0"/>
-            </a:camera>
-            <a:lightRig rig="threePt" dir="t">
-              <a:rot lat="0" lon="0" rev="1200000"/>
-            </a:lightRig>
-          </a:scene3d>
-          <a:sp3d>
-            <a:bevelT w="63500" h="25400"/>
-          </a:sp3d>
         </a:effectStyle>
       </a:effectStyleLst>
       <a:bgFillStyleLst>
         <a:solidFill>
           <a:schemeClr val="phClr"/>
         </a:solidFill>
+        <a:solidFill>
+          <a:schemeClr val="phClr">
+            <a:tint val="95000"/>
+            <a:satMod val="170000"/>
+          </a:schemeClr>
+        </a:solidFill>
         <a:gradFill rotWithShape="1">
           <a:gsLst>
             <a:gs pos="0">
               <a:schemeClr val="phClr">
-                <a:tint val="40000"/>
-                <a:satMod val="350000"/>
+                <a:tint val="93000"/>
+                <a:satMod val="150000"/>
+                <a:shade val="98000"/>
+                <a:lumMod val="102000"/>
               </a:schemeClr>
             </a:gs>
-            <a:gs pos="40000">
+            <a:gs pos="50000">
               <a:schemeClr val="phClr">
-                <a:tint val="45000"/>
-                <a:shade val="99000"/>
-                <a:satMod val="350000"/>
+                <a:tint val="98000"/>
+                <a:satMod val="130000"/>
+                <a:shade val="90000"/>
+                <a:lumMod val="103000"/>
               </a:schemeClr>
             </a:gs>
             <a:gs pos="100000">
               <a:schemeClr val="phClr">
-                <a:shade val="20000"/>
-                <a:satMod val="255000"/>
+                <a:shade val="63000"/>
+                <a:satMod val="120000"/>
               </a:schemeClr>
             </a:gs>
           </a:gsLst>
-          <a:path path="circle">
-            <a:fillToRect l="50000" t="-80000" r="50000" b="180000"/>
-          </a:path>
-        </a:gradFill>
-        <a:gradFill rotWithShape="1">
-          <a:gsLst>
-            <a:gs pos="0">
-              <a:schemeClr val="phClr">
-                <a:tint val="80000"/>
-                <a:satMod val="300000"/>
-              </a:schemeClr>
-            </a:gs>
-            <a:gs pos="100000">
-              <a:schemeClr val="phClr">
-                <a:shade val="30000"/>
-                <a:satMod val="200000"/>
-              </a:schemeClr>
-            </a:gs>
-          </a:gsLst>
-          <a:path path="circle">
-            <a:fillToRect l="50000" t="50000" r="50000" b="50000"/>
-          </a:path>
+          <a:lin ang="5400000" scaled="0"/>
         </a:gradFill>
       </a:bgFillStyleLst>
     </a:fmtScheme>
   </a:themeElements>
-  <a:objectDefaults>
-    <a:spDef>
-      <a:spPr/>
-      <a:bodyPr/>
-      <a:lstStyle/>
-      <a:style>
-        <a:lnRef idx="1">
-          <a:schemeClr val="accent1"/>
-        </a:lnRef>
-        <a:fillRef idx="3">
-          <a:schemeClr val="accent1"/>
-        </a:fillRef>
-        <a:effectRef idx="2">
-          <a:schemeClr val="accent1"/>
-        </a:effectRef>
-        <a:fontRef idx="minor">
-          <a:schemeClr val="lt1"/>
-        </a:fontRef>
-      </a:style>
-    </a:spDef>
-    <a:lnDef>
-      <a:spPr/>
-      <a:bodyPr/>
-      <a:lstStyle/>
-      <a:style>
-        <a:lnRef idx="2">
-          <a:schemeClr val="accent1"/>
-        </a:lnRef>
-        <a:fillRef idx="0">
-          <a:schemeClr val="accent1"/>
-        </a:fillRef>
-        <a:effectRef idx="1">
-          <a:schemeClr val="accent1"/>
-        </a:effectRef>
-        <a:fontRef idx="minor">
-          <a:schemeClr val="tx1"/>
-        </a:fontRef>
-      </a:style>
-    </a:lnDef>
-  </a:objectDefaults>
+  <a:objectDefaults/>
   <a:extraClrSchemeLst/>
+  <a:extLst>
+    <a:ext uri="{05A4C25C-085E-4340-85A3-A5531E510DB2}">
+      <thm15:themeFamily xmlns:thm15="http://schemas.microsoft.com/office/thememl/2012/main" name="Office Theme" id="{62F939B6-93AF-4DB8-9C6B-D6C7DFDC589F}" vid="{4A3C46E8-61CC-4603-A589-7422A47A8E4A}"/>
+    </a:ext>
+  </a:extLst>
 </a:theme>
-</file>
-
-<file path=customXml/item1.xml><?xml version="1.0" encoding="utf-8"?>
-<b:Sources xmlns:b="http://schemas.openxmlformats.org/officeDocument/2006/bibliography" xmlns="http://schemas.openxmlformats.org/officeDocument/2006/bibliography" SelectedStyle="\APASixthEditionOfficeOnline.xsl" StyleName="APA" Version="6"/>
-</file>
-
-<file path=customXml/item2.xml><?xml version="1.0" encoding="utf-8"?>
-<go:gDocsCustomXmlDataStorage xmlns:go="http://customooxmlschemas.google.com/" xmlns:r="http://schemas.openxmlformats.org/officeDocument/2006/relationships">
-  <go:docsCustomData xmlns:go="http://customooxmlschemas.google.com/" roundtripDataSignature="AMtx7mgBpdSUoi/mnewRXR/5Xa2ov0DU8Q==">AMUW2mV2YmApWYHwx5jlwU4VezvwVC0oMGV1qHP1ug/+tjxIr50P9c5S/OEj761jQBzxlJcB83xpGrMUPXs4ikx+NI4ihxgbLXM+MlAuWpGKOf90eSJZMf0xcVXTIaQtfZ5POOhP42OT</go:docsCustomData>
-</go:gDocsCustomXmlDataStorage>
-</file>
-
-<file path=customXml/itemProps1.xml><?xml version="1.0" encoding="utf-8"?>
-<ds:datastoreItem xmlns:ds="http://schemas.openxmlformats.org/officeDocument/2006/customXml" ds:itemID="{6EDDB96C-0C33-4E3E-B8B5-DB6FD0FA2820}">
-  <ds:schemaRefs>
-    <ds:schemaRef ds:uri="http://schemas.openxmlformats.org/officeDocument/2006/bibliography"/>
-  </ds:schemaRefs>
-</ds:datastoreItem>
-</file>
-
-<file path=customXml/itemProps2.xml><?xml version="1.0" encoding="utf-8"?>
-<ds:datastoreItem xmlns:ds="http://schemas.openxmlformats.org/officeDocument/2006/customXml" ds:itemID="{11111111-1234-1234-1234-123412341234}">
-  <ds:schemaRefs>
-    <ds:schemaRef ds:uri="http://customooxmlschemas.google.com/"/>
-    <ds:schemaRef ds:uri="http://schemas.openxmlformats.org/officeDocument/2006/relationships"/>
-  </ds:schemaRefs>
-</ds:datastoreItem>
 </file>
</xml_diff>